<commit_message>
Run.bat now installs every dependency
</commit_message>
<xml_diff>
--- a/downloads/CTIG Book 110 2025-26.docx
+++ b/downloads/CTIG Book 110 2025-26.docx
@@ -2300,7 +2300,7 @@
           <w:sz w:val="24"/>
           <w:u w:val="single"/>
         </w:rPr>
-        <w:hyperlink r:id="rId16" w:history="1">
+        <w:hyperlink r:id="rId15" w:history="1">
           <w:r>
             <w:rPr>
               <w:rStyle w:val="Hyperlink"/>
@@ -2360,7 +2360,7 @@
           <w:sz w:val="24"/>
           <w:u w:val="single"/>
         </w:rPr>
-        <w:hyperlink r:id="rId17" w:history="1">
+        <w:hyperlink r:id="rId18" w:history="1">
           <w:r>
             <w:rPr>
               <w:rStyle w:val="Hyperlink"/>
@@ -2399,7 +2399,7 @@
           <w:sz w:val="24"/>
           <w:u w:val="single"/>
         </w:rPr>
-        <w:hyperlink r:id="rId18" w:history="1">
+        <w:hyperlink r:id="rId19" w:history="1">
           <w:r>
             <w:rPr>
               <w:rStyle w:val="Hyperlink"/>
@@ -2420,7 +2420,7 @@
           <w:sz w:val="24"/>
           <w:u w:val="single"/>
         </w:rPr>
-        <w:hyperlink r:id="rId19" w:history="1">
+        <w:hyperlink r:id="rId20" w:history="1">
           <w:r>
             <w:rPr>
               <w:rStyle w:val="Hyperlink"/>
@@ -2441,7 +2441,7 @@
           <w:sz w:val="24"/>
           <w:u w:val="single"/>
         </w:rPr>
-        <w:hyperlink r:id="rId19" w:history="1">
+        <w:hyperlink r:id="rId21" w:history="1">
           <w:r>
             <w:rPr>
               <w:rStyle w:val="Hyperlink"/>

</xml_diff>